<commit_message>
sigma: procurações — corrigir texto poderes e campo substabelecimento
- procuracao_sigma.docx + TEMPLATES_SIGMA: substituir "amplos, gerais e
  ilimitados poderes" por "poderes específicos e limitados aos atos
  necessários..." (alinhado com modelo da rede atualizado em 17/06/2026)
- substabelecimento_sem_reserva_sigma.docx: adicionar campo faltante
  "Poderes Substabelecidos:" entre o corpo e a cláusula de vigência

Co-Authored-By: Claude Sonnet 4.6 <noreply@anthropic.com>
</commit_message>
<xml_diff>
--- a/static/modelos_procuracao/substabelecimento_sem_reserva_sigma.docx
+++ b/static/modelos_procuracao/substabelecimento_sem_reserva_sigma.docx
@@ -474,6 +474,11 @@
           <w:rFonts w:ascii="Times New Roman" w:eastAsia="Times New Roman" w:hAnsi="Times New Roman" w:cs="Times New Roman"/>
         </w:rPr>
         <w:t>podendo praticar os atos necessários na demanda, iguais aos que me foram outorgados.</w:t>
+      </w:r>
+    </w:p>
+    <w:p>
+      <w:r>
+        <w:t>Poderes Substabelecidos: </w:t>
       </w:r>
     </w:p>
     <w:p>

</xml_diff>